<commit_message>
Revise proposal: soften causal claims, exploratory Welch stats, Bradford-reactive protein terminology
Co-authored-by: fran0220 <fran0220@users.noreply.github.com>
</commit_message>
<xml_diff>
--- a/docs/proposal/The_Effects_of_Source_and_Processing_on_Protein_and_Lipid_in_Plant-Derived_Foods.docx
+++ b/docs/proposal/The_Effects_of_Source_and_Processing_on_Protein_and_Lipid_in_Plant-Derived_Foods.docx
@@ -288,7 +288,7 @@
         <w:pStyle w:val="FirstParagraph"/>
       </w:pPr>
       <w:r>
-        <w:t xml:space="preserve">The rapid expansion of the plant-based food market has intensified the need for reliable biochemical characterisation of products whose composition varies with botanical source and processing. This proposal outlines a comparative study of two biochemical categories, protein and lipid, across four plant-derived foods: almond milk and soy milk (protein), and cold-pressed walnut oil and refined soybean oil (lipid). The study asks how source and processing influence soluble protein concentration in plant-based milks and hydrolytic lipid quality, expressed as acid value, in edible oils. Soluble protein will be quantified using the Bradford assay, selected over the Biuret method for its sensitivity in dilute matrices, while acid value titration is preferred to peroxide value for its stable, cumulative endpoint that directly reflects refining history. Each product will be purchased as three independent production batches and analysed in triplicate against reagent blanks and calibration standards. Independent-samples t-tests (α = .05) will compare group means within each category after assumption checking. Supplied high-performance liquid chromatography (HPLC) amino acid profiles and gas chromatography (GC) fatty acid profiles will verify and extend the wet-chemistry findings. The results are expected to demonstrate that source and processing jointly determine the quality of plant-derived foods.</w:t>
+        <w:t xml:space="preserve">Plant-derived foods vary widely in composition with source, formulation and processing. This study compares four commercial products in two biochemical categories: protein in soy and almond milks, lipid in cold-pressed walnut and refined soybean oils. Bradford-reactive protein (mg BSA equivalents/mL) will be quantified by the Bradford assay, selected for its high sensitivity and tolerance of substantial dilution, which may reduce turbidity-related interference in plant-milk matrices. Acid value was selected as a relatively stable measure of free fatty acids and hydrolytic quality relevant to cold-pressed versus refined oils. Three production lots per product will be analysed in triplicate, and lot-level means compared using exploratory two-sided Welch t-tests, reporting effect sizes and confidence intervals alongside p-values. Supplied HPLC amino acid and GC fatty acid profiles will complement and extend interpretation of the wet-chemistry results. Soy milk is expected to show higher Bradford-reactive protein than almond milk, and walnut oil a higher acid value than soybean oil. As source, formulation and processing are not independently controlled, findings will be interpreted as product-specific differences rather than causal effects.</w:t>
       </w:r>
     </w:p>
     <w:bookmarkEnd w:id="22"/>
@@ -306,7 +306,7 @@
         <w:pStyle w:val="FirstParagraph"/>
       </w:pPr>
       <w:r>
-        <w:t xml:space="preserve">Plant-derived foods now occupy a substantial and growing share of the global food supply, driven by consumer concerns about health, sustainability and animal welfare (Sethi et al., 2016). Plant-based products are compositionally heterogeneous, however: their protein and lipid content depends both on the botanical raw material and on the unit operations used to convert it into a finished food (Vanga &amp; Raghavan, 2018). Understanding these two levers, source and processing, is therefore central to evaluating the nutritional equivalence and chemical quality of plant-based alternatives.</w:t>
+        <w:t xml:space="preserve">Plant-derived foods occupy a growing share of the global food supply, driven by concerns about health, sustainability and animal welfare (Sethi et al., 2016). Plant-based products are compositionally heterogeneous, however: their protein and lipid content is associated both with the botanical raw material and with the unit operations used to convert it into a finished food (Vanga &amp; Raghavan, 2018). Examining these source- and processing-associated differences is central to evaluating the quality of plant-based alternatives.</w:t>
       </w:r>
     </w:p>
     <w:p>
@@ -314,7 +314,7 @@
         <w:pStyle w:val="BodyText"/>
       </w:pPr>
       <w:r>
-        <w:t xml:space="preserve">Source effects arise because different plant tissues store macronutrients differently. Soybeans are protein-dense legume seeds containing roughly 36–40% protein on a dry basis, whereas almonds are tree nuts in which lipid, not protein, is the dominant storage reserve (Vanga &amp; Raghavan, 2018). Similarly, walnut and soybean oils both derive from oilseeds but differ in fatty acid composition, with walnut oil being unusually rich in α-linolenic acid (Martínez et al., 2010).</w:t>
+        <w:t xml:space="preserve">Source-associated differences arise because different plant tissues store macronutrients differently. Soybeans are protein-dense legume seeds containing roughly 36–40% protein on a dry basis, whereas in almonds lipid, not protein, is the dominant storage reserve (Vanga &amp; Raghavan, 2018). Walnut and soybean oils likewise differ in fatty acid composition, with walnut oil unusually rich in α-linolenic acid (Martínez et al., 2010).</w:t>
       </w:r>
     </w:p>
     <w:p>
@@ -322,7 +322,7 @@
         <w:pStyle w:val="BodyText"/>
       </w:pPr>
       <w:r>
-        <w:t xml:space="preserve">Processing effects are equally important. Plant milks are produced by soaking, wet milling, filtration, formulation and thermal treatment, steps that dilute and partially remove protein (Sethi et al., 2016). Edible oils diverge even more sharply: cold pressing extracts oil mechanically at low temperature and retains free fatty acids (FFA) and minor constituents, whereas industrial refining deliberately removes FFA through alkali neutralisation, bleaching and deodorisation (Gharby, 2022).</w:t>
+        <w:t xml:space="preserve">Processing-associated differences are equally important. Plant milks are produced by soaking, wet milling, filtration, formulation and thermal treatment, steps that dilute and partially remove protein (Sethi et al., 2016). Edible oils diverge more sharply: cold pressing extracts oil mechanically at low temperature and retains free fatty acids (FFA), whereas industrial refining removes FFA through alkali neutralisation, bleaching and deodorisation (Gharby, 2022).</w:t>
       </w:r>
     </w:p>
     <w:p>
@@ -330,7 +330,7 @@
         <w:pStyle w:val="BodyText"/>
       </w:pPr>
       <w:r>
-        <w:t xml:space="preserve">This proposal therefore addresses the research question: how do differences in botanical source and processing influence soluble protein content in plant-based milks and hydrolytic lipid quality, measured as acid value, in plant-derived oils? The aim is to quantify and compare these two biochemical categories across four commercial products using validated wet-chemistry methods supported by instrumental data. Two hypotheses are proposed. H1: soy milk will contain a significantly higher soluble protein concentration than almond milk, reflecting the greater protein density of the legume source. H2: cold-pressed walnut oil will exhibit a significantly higher acid value than refined soybean oil, because refining removes the free fatty acids that cold pressing retains.</w:t>
+        <w:t xml:space="preserve">Because botanical source, formulation and processing are not independently manipulated in this study, the selected products represent combined commercial product conditions rather than isolated causal factors. The research question is therefore: how are source- and processing-associated differences reflected in Bradford-reactive protein concentration in commercial soy and almond milks and in acid value in cold-pressed walnut and refined soybean oils, and how can HPLC amino acid and GC fatty acid profiles support interpretation of these differences? The aim is to compare Bradford-reactive protein concentration and acid value among the selected products and to use the supplied HPLC and GC profiles to provide compositional context for the observed differences. Two hypotheses are proposed. H1: commercial soy milk will have a significantly higher Bradford-reactive protein concentration, expressed as BSA equivalents, than commercial almond milk. This expectation is consistent with the greater protein density of the legume raw material. H2: cold-pressed walnut oil will have a significantly higher acid value than refined soybean oil. This prediction is based on the removal of free fatty acids during alkali neutralisation in refining.</w:t>
       </w:r>
     </w:p>
     <w:bookmarkEnd w:id="23"/>
@@ -357,7 +357,7 @@
         <w:pStyle w:val="FirstParagraph"/>
       </w:pPr>
       <w:r>
-        <w:t xml:space="preserve">Soy milk and almond milk are the two most established plant-based milk alternatives and provide a scientifically meaningful contrast in protein content attributable primarily to source. Commercial soy milk typically contains 2.9–3.3 g protein per 100 mL, a level comparable to bovine milk, whereas almond milk generally supplies only 0.4–0.6 g per 100 mL (Jeske et al., 2017; Vanga &amp; Raghavan, 2018). Because both beverages are manufactured through broadly similar operations, the large compositional difference can be attributed chiefly to the raw material and its formulation level rather than to divergent processing chemistry (Sethi et al., 2016). This pairing therefore isolates the source effect while remaining nutritionally relevant, since consumers substituting dairy milk with almond milk may unknowingly reduce their protein intake substantially (Vanga &amp; Raghavan, 2018).</w:t>
+        <w:t xml:space="preserve">Soy and almond milks are the most established plant-based milk alternatives and provide a meaningful protein contrast. Commercial soy milk typically contains 2.9–3.3 g protein per 100 mL, comparable to bovine milk, whereas almond milk generally supplies only 0.4–0.6 g per 100 mL (Jeske et al., 2017; Vanga &amp; Raghavan, 2018). Because both beverages are manufactured through broadly similar operations, this difference likely reflects chiefly the raw material and formulation level rather than divergent processing chemistry (Sethi et al., 2016). The pairing highlights a source-associated difference and is nutritionally relevant, since consumers replacing dairy with almond milk may unknowingly reduce protein intake (Vanga &amp; Raghavan, 2018).</w:t>
       </w:r>
     </w:p>
     <w:bookmarkEnd w:id="24"/>
@@ -375,7 +375,7 @@
         <w:pStyle w:val="FirstParagraph"/>
       </w:pPr>
       <w:r>
-        <w:t xml:space="preserve">The Bradford assay quantifies protein through the binding of Coomassie Brilliant Blue G-250 to arginine and hydrophobic residues under acidic conditions, shifting the dye’s absorbance maximum from 465 nm to 595 nm (Bradford, 1976). Its principal advantages are sensitivity, detecting approximately 1–20 µg of protein, speed, and tolerance of many common buffer components (Bradford, 1976; Kruger, 2009). This sensitivity is decisive for the selected matrices: almond milk is so dilute in protein that the Biuret method, whose working range lies in the milligram region, would require impractical concentration steps before measurement (Gornall et al., 1949; Kruger, 2009).</w:t>
+        <w:t xml:space="preserve">The Bradford assay quantifies protein through binding of Coomassie Brilliant Blue G-250 to arginine and hydrophobic residues under acidic conditions, shifting the dye’s absorbance maximum from 465 to 595 nm (Bradford, 1976). Its advantages are sensitivity (approximately 1–20 µg protein), speed, and tolerance of common buffer components (Bradford, 1976; Kruger, 2009). This sensitivity, and the dilution it permits, is advantageous for plant-milk emulsions: measuring low-protein almond milk with the Biuret method, whose working range lies in the milligram region, would be more demanding (Gornall et al., 1949).</w:t>
       </w:r>
     </w:p>
     <w:p>
@@ -383,7 +383,7 @@
         <w:pStyle w:val="BodyText"/>
       </w:pPr>
       <w:r>
-        <w:t xml:space="preserve">The Biuret method, in which Cu²⁺ ions complex with peptide bonds under alkaline conditions to form a purple chromophore absorbing at 540 nm, does offer one genuine advantage: because it responds to the peptide backbone rather than to specific side chains, its colour yield varies little between proteins (Gornall et al., 1949). By contrast, the Bradford assay shows protein-to-protein variability because dye binding depends on amino acid composition, so plant proteins may respond differently from the bovine serum albumin (BSA) standard (Kruger, 2009). Bradford results can also be depressed by detergents and confounded by non-linearity at high concentrations. These limitations are manageable here: all samples will be calibrated against the same BSA curve, so between-sample comparisons remain valid, and lipid turbidity in the milk emulsions, which interferes with Biuret photometry, is minimised by the high dilutions the Bradford assay permits. On balance, Bradford’s sensitivity, speed and suitability for dilute emulsified beverages make it the more defensible choice, provided its dye-binding bias is acknowledged and cross-checked instrumentally.</w:t>
+        <w:t xml:space="preserve">The Biuret method, in which Cu²⁺ complexes with peptide bonds in alkali to form a chromophore absorbing at 540 nm, responds to the peptide backbone rather than specific side chains, so its colour yield varies little between proteins (Gornall et al., 1949). By contrast, Bradford dye binding depends on amino acid composition, so plant proteins may respond differently from the bovine serum albumin (BSA) standard, and results can be depressed by detergents or non-linearity at high concentrations (Kruger, 2009). These limitations are manageable: all samples will be calibrated against the same BSA curve and reported as BSA equivalents, and the high dilutions Bradford permits may reduce the lipid turbidity that interferes with Biuret photometry. On balance, Bradford is the more defensible choice for dilute emulsified beverages, provided its dye-binding bias is interpreted alongside instrumental data.</w:t>
       </w:r>
     </w:p>
     <w:bookmarkEnd w:id="25"/>
@@ -401,7 +401,7 @@
         <w:pStyle w:val="FirstParagraph"/>
       </w:pPr>
       <w:r>
-        <w:t xml:space="preserve">The central limitation of the Bradford assay is that it reports only total soluble protein, with no information on protein quality, and its output is biased by amino acid composition (Kruger, 2009). The supplied HPLC amino acid dataset addresses both weaknesses. Because HPLC quantifies individual amino acids after hydrolysis and derivatisation (Otter, 2012), the summed amino acid content provides an independent verification of the Bradford totals, revealing whether dye-binding bias distorted the comparison between soy and almond proteins. The profile also extends the findings: it will show whether soy milk delivers a more complete essential amino acid spectrum, particularly lysine, than almond milk, converting a simple quantitative comparison into a nutritionally interpretable conclusion in the final presentation.</w:t>
+        <w:t xml:space="preserve">The Bradford assay reports only Bradford-reactive protein as BSA equivalents, with no information on protein quality, and its output is biased by amino acid composition (Kruger, 2009). The supplied HPLC amino acid dataset helps address both weaknesses. Because HPLC quantifies individual amino acids after hydrolysis and derivatisation (Otter, 2012), it provides compositional context for the Bradford totals, indicating whether dye-binding bias may have influenced the soy–almond comparison. The profile also extends the findings by showing whether soy milk delivers a more complete essential amino acid spectrum, particularly lysine, supporting nutritional interpretation.</w:t>
       </w:r>
     </w:p>
     <w:bookmarkEnd w:id="26"/>
@@ -419,7 +419,7 @@
         <w:pStyle w:val="FirstParagraph"/>
       </w:pPr>
       <w:r>
-        <w:t xml:space="preserve">Walnut oil and soybean oil form a complementary pairing in which both source and processing differ systematically. Walnut oil contains approximately 70% polyunsaturated fatty acids, including 10–14% α-linolenic acid, and is typically cold-pressed to preserve its delicate flavour and bioactive minor constituents (Martínez et al., 2010). Soybean oil is likewise polyunsaturated, dominated by linoleic acid, but is almost universally subjected to full chemical refining, including alkali neutralisation that strips free fatty acids from the crude oil (Gharby, 2022). Comparing a cold-pressed with a refined oil directly probes the processing effect on hydrolytic quality: Codex standards permit an acid value up to 4.0 mg KOH/g in cold-pressed oils but only 0.6 in refined oils (Codex Alimentarius Commission, 1999). The pairing is also nutritionally relevant, as both oils are marketed as sources of essential fatty acids whose quality deteriorates through hydrolysis and oxidation (Choe &amp; Min, 2006).</w:t>
+        <w:t xml:space="preserve">Walnut and soybean oils form a pairing in which both source and processing differ systematically. Walnut oil contains approximately 70% polyunsaturated fatty acids, including 10–14% α-linolenic acid, and is typically cold-pressed to preserve flavour and minor constituents (Martínez et al., 2010). Soybean oil, dominated by linoleic acid, is almost universally chemically refined, including alkali neutralisation that removes free fatty acids (Gharby, 2022). Comparing cold-pressed with refined oil provides a relevant contrast in processing-associated hydrolytic quality: Codex standards permit acid values up to 4.0 mg KOH/g in cold-pressed but only 0.6 in refined oils (Codex Alimentarius Commission, 1999). The pairing is also nutritionally relevant, as both oils are marketed as sources of essential fatty acids whose quality deteriorates through hydrolysis and oxidation (Choe &amp; Min, 2006).</w:t>
       </w:r>
     </w:p>
     <w:bookmarkEnd w:id="27"/>
@@ -437,7 +437,7 @@
         <w:pStyle w:val="FirstParagraph"/>
       </w:pPr>
       <w:r>
-        <w:t xml:space="preserve">Acid value (AV) measures hydrolytic rancidity as the mass of potassium hydroxide, in mg, required to neutralise the free fatty acids in 1 g of oil, determined by direct titration to a phenolphthalein endpoint (AOCS, 2017). Its advantages are threefold. First, FFA are chemically stable analytes, so AV is a cumulative, monotonic indicator of hydrolytic history that does not change appreciably between sampling and analysis. Second, AV responds directly to the processing contrast under investigation, because neutralisation during refining is designed precisely to remove FFA (Gharby, 2022). Third, the titration is simple, inexpensive and highly reproducible with a standardised titrant.</w:t>
+        <w:t xml:space="preserve">Acid value (AV) measures hydrolytic rancidity as the milligrams of potassium hydroxide required to neutralise the free fatty acids in 1 g of oil, determined by titration to a phenolphthalein endpoint (AOCS, 2017). FFA are chemically stable analytes, so AV changes little between sampling and analysis. AV is also relevant to the processing contrast, because refining neutralisation is designed to remove FFA (Gharby, 2022), although raw material quality, lipase activity and storage conditions also influence free acidity. Finally, the titration is simple, inexpensive and reproducible with a standardised titrant.</w:t>
       </w:r>
     </w:p>
     <w:p>
@@ -445,7 +445,7 @@
         <w:pStyle w:val="BodyText"/>
       </w:pPr>
       <w:r>
-        <w:t xml:space="preserve">Peroxide value (PV), the principal alternative, measures primary oxidation by iodometric titration of hydroperoxides (AOCS, 2017). Although PV is valuable for detecting early oxidative rancidity (Choe &amp; Min, 2006), it has a fundamental weakness for a single-time-point comparison of retail products: hydroperoxides are transient intermediates that accumulate and then decompose, so an identical PV can correspond to either early or advanced oxidation (Shahidi &amp; Zhong, 2005). The iodometric procedure is also sensitive to light, temperature and dissolved oxygen, reducing reproducibility (Shahidi &amp; Zhong, 2005). AV is therefore preferred as the more stable and interpretable index for these samples. Its limitations are acknowledged: AV is blind to oxidative deterioration, and endpoint detection can be obscured in deeply coloured oils, though both selected oils permit reliable visual titration.</w:t>
+        <w:t xml:space="preserve">Peroxide value (PV), the alternative, measures primary oxidation by iodometric titration of hydroperoxides (AOCS, 2017). Although PV detects early oxidative rancidity (Choe &amp; Min, 2006), it is weak for single-time-point comparisons: hydroperoxides are transient intermediates that accumulate and then decompose, so an identical PV can reflect early or advanced oxidation (Shahidi &amp; Zhong, 2005). The iodometric procedure is also sensitive to light, temperature and dissolved oxygen (Shahidi &amp; Zhong, 2005), so AV is preferred as the more stable index. Its limitations are acknowledged: AV is blind to oxidative deterioration, and endpoint detection can be obscured in deeply coloured oils, though both selected oils permit reliable titration.</w:t>
       </w:r>
     </w:p>
     <w:bookmarkEnd w:id="28"/>
@@ -463,7 +463,7 @@
         <w:pStyle w:val="FirstParagraph"/>
       </w:pPr>
       <w:r>
-        <w:t xml:space="preserve">The acid value quantifies total free acidity but cannot identify which fatty acids are present, nor characterise the unsaturation that governs each oil’s susceptibility to further deterioration. The supplied GC fatty acid profile, obtained as fatty acid methyl esters, resolves both limitations. It verifies the wet-chemistry interpretation by confirming the expected compositional signatures, such as the high α-linolenic acid content characteristic of authentic walnut oil (Martínez et al., 2010). It also extends the findings: polyunsaturated-to-saturated ratios derived from the chromatograms will contextualise why AV differences matter, since liberated polyunsaturated FFA oxidise faster than their esterified forms (Choe &amp; Min, 2006), linking hydrolytic status to oxidative risk and nutritional value.</w:t>
+        <w:t xml:space="preserve">Acid value quantifies total free acidity but cannot identify the fatty acids present nor characterise the unsaturation that governs susceptibility to further deterioration. The supplied GC fatty acid profile, obtained as fatty acid methyl esters, helps address both limitations. It complements the wet-chemistry interpretation by indicating whether expected signatures, such as the high α-linolenic acid content of authentic walnut oil, are present (Martínez et al., 2010). It also extends the findings: polyunsaturated-to-saturated ratios from the chromatograms will contextualise why AV differences matter, since liberated polyunsaturated FFA oxidise faster than their esterified forms (Choe &amp; Min, 2006).</w:t>
       </w:r>
     </w:p>
     <w:bookmarkEnd w:id="29"/>
@@ -482,7 +482,7 @@
         <w:pStyle w:val="FirstParagraph"/>
       </w:pPr>
       <w:r>
-        <w:t xml:space="preserve">The study uses a comparative cross-sectional design with two parallel arms. The independent variable in each arm is the product, representing a combined source–processing condition: almond milk versus soy milk in the protein arm, and cold-pressed walnut oil versus refined soybean oil in the lipid arm. The dependent variables are soluble protein concentration (mg/mL) and acid value (mg KOH/g), respectively. For each product, three retail units bearing different lot numbers will be purchased to serve as independent biological replicates, and each unit will be analysed in analytical triplicate. Analytical replicates will be averaged per lot before inference, giving n = 3 per group and avoiding pseudoreplication. All samples will be stored as recommended and analysed before their best-before dates within a single week.</w:t>
+        <w:t xml:space="preserve">The study uses a comparative cross-sectional design with two parallel arms. The independent variable in each arm is product identity, representing a combined commercial condition involving source, formulation and processing: soy versus almond milk, and cold-pressed walnut versus refined soybean oil. The dependent variables are Bradford-reactive protein concentration (mg BSA equivalents/mL) and acid value (mg KOH/g oil). Three independent retail units from different production lots per product will serve as production-lot replicates, each analysed in analytical triplicate; triplicates will be averaged so that lot means are the independent observations (n = 3 per group), avoiding pseudoreplication. To limit unnecessary variation, milks will be unflavoured, unsweetened and of similar fortification status, and oils will be single-species, non-blended and explicitly labelled cold-pressed or refined; brand, ingredient list, nutrition label, packaging, lot number and best-before date will be recorded, with brand and formulation acknowledged as potential confounders. All samples will be stored as recommended and analysed within a single week.</w:t>
       </w:r>
     </w:p>
     <w:p>
@@ -490,7 +490,7 @@
         <w:pStyle w:val="BodyText"/>
       </w:pPr>
       <w:r>
-        <w:t xml:space="preserve">In the protein arm, milks will be diluted with phosphate-buffered saline to fall within the linear range of the Bradford macroassay. A seven-point BSA calibration curve (0.1–1.0 mg/mL) will be prepared with each analytical session, accepted only if R² ≥ 0.995, and a mid-curve quality-control standard will be run every ten samples. A reagent blank containing buffer and Bradford reagent will zero the spectrophotometer at 595 nm (Bradford, 1976). In the lipid arm, acid value will be determined following AOCS Official Method Cd 3d-63: accurately weighed oil will be dissolved in neutralised solvent and titrated with 0.1 M ethanolic KOH, standardised against potassium hydrogen phthalate, to a persistent phenolphthalein endpoint (AOCS, 2017). A solvent blank titration will be subtracted from every determination.</w:t>
+        <w:t xml:space="preserve">In the protein arm, all milks will receive identical homogenisation before dilution with phosphate-buffered saline into the Bradford working range, using at least two dilution factors per sample to check dilution linearity. A seven-point BSA calibration curve (0.1–1.0 mg/mL) will be prepared each session and accepted only if R² ≥ 0.995 and a mid-curve quality-control standard recovers within 90–110%. A reagent blank will zero the spectrophotometer at 595 nm, sample-specific matrix blanks will correct background absorbance, and spike-recovery checks will be performed if interference is suspected (Bradford, 1976). Absorbances outside the calibration range will be re-diluted rather than extrapolated. In the lipid arm, acid value will follow AOCS Method Cd 3d-63: each lot will be mixed before subsampling, dissolved in neutralised solvent and titrated in triplicate with standardised 0.1 M ethanolic KOH to a consistent persistent phenolphthalein endpoint, with a solvent blank subtracted (AOCS, 2017). All titrations will be performed at the same temperature within a narrow time window, and AV differences will be interpreted as differences in free acidity among products rather than attributed solely to refining.</w:t>
       </w:r>
     </w:p>
     <w:p>
@@ -498,7 +498,7 @@
         <w:pStyle w:val="BodyText"/>
       </w:pPr>
       <w:r>
-        <w:t xml:space="preserve">Data will be summarised as mean ± standard deviation. Normality will be assessed with the Shapiro–Wilk test and homogeneity of variance with Levene’s test. Provided assumptions hold, each hypothesis will be evaluated with a two-tailed independent-samples t-test at α = .05, applying Welch’s correction if variances are unequal; if normality fails, the Mann–Whitney U test will be substituted. Cohen’s d will quantify effect sizes. Results will be presented as bar charts with error bars and summary tables, and a Pearson correlation between Bradford totals and summed HPLC amino acid contents will quantify agreement between wet-chemistry and instrumental measurements. Key limitations include the small number of lots per product, possible brand-specific formulation effects, and the single sampling time point, which precludes kinetic conclusions about deterioration.</w:t>
+        <w:t xml:space="preserve">Because only three independent lots are available per group, formal normality and variance tests would be uninformative; lot-level means will instead be compared with exploratory two-sided Welch t-tests (α = .05), which do not assume equal variances. Each comparison will report individual lot-level data points, mean ± standard deviation, mean difference, 95% confidence interval, p-value and Hedges’ g, a small-sample-corrected effect size. Results will be presented as individual value plots displaying all lot-level observations with group means and variability estimates, rather than bar charts alone. Bradford and HPLC findings will be compared descriptively in terms of the direction and relative magnitude of product differences, since the supplied profiles may not be lot-matched. GC data will be summarised as relative percentages of major fatty acids (linoleic, α-linolenic, total saturated, total polyunsaturated) and used descriptively to contextualise oil identity and unsaturation rather than to validate acid value. Key limitations include the lack of independent control over source, formulation and processing, the few lots, the single time point, protein-specific dye-binding bias against the BSA calibrant, AV’s insensitivity to oxidation, possible mismatch between supplied instrumental data and experimental lots, and the exploratory nature of inference at n = 3.</w:t>
       </w:r>
     </w:p>
     <w:bookmarkEnd w:id="31"/>
@@ -516,7 +516,7 @@
         <w:pStyle w:val="FirstParagraph"/>
       </w:pPr>
       <w:r>
-        <w:t xml:space="preserve">This proposal presents a coherent, feasible design for testing how botanical source and processing shape two biochemical categories in plant-derived foods. The protein arm contrasts a legume-based and a nut-based milk using the Bradford assay, justified over the Biuret method by its sensitivity in dilute matrices, while the lipid arm contrasts a cold-pressed and a refined oil using acid value, justified over peroxide value by its stability and direct link to refining. Supplied HPLC and GC datasets will verify the wet-chemistry results and extend them toward protein quality and fatty acid nutrition. With replicated sampling, appropriate blanks, calibration standards and clearly specified statistics, the study is expected to confirm that source governs protein density in plant milks and that processing governs hydrolytic quality in edible oils, providing evidence directly relevant to consumers and manufacturers of plant-based foods.</w:t>
+        <w:t xml:space="preserve">This proposal presents a feasible design for comparing protein- and lipid-related differences among commercial plant-derived foods. The protein arm contrasts a legume-based and a nut-based milk using the Bradford assay, justified against the Biuret method, while the lipid arm contrasts a cold-pressed and a refined oil using acid value, justified against peroxide value. Supplied HPLC and GC datasets will complement the wet-chemistry results and extend their interpretation toward amino acid composition and fatty acid unsaturation. With production-lot replication, blanks, calibration standards and exploratory statistics, the study is expected to identify product-specific differences consistent with source, formulation and processing, providing practically relevant evidence for consumers and manufacturers of plant-based foods.</w:t>
       </w:r>
     </w:p>
     <w:bookmarkEnd w:id="32"/>

</xml_diff>

<commit_message>
Align statistics with course content (Minitab two-sample t-test), refine wording per feedback
Co-authored-by: fran0220 <fran0220@users.noreply.github.com>
</commit_message>
<xml_diff>
--- a/docs/proposal/The_Effects_of_Source_and_Processing_on_Protein_and_Lipid_in_Plant-Derived_Foods.docx
+++ b/docs/proposal/The_Effects_of_Source_and_Processing_on_Protein_and_Lipid_in_Plant-Derived_Foods.docx
@@ -288,7 +288,7 @@
         <w:pStyle w:val="FirstParagraph"/>
       </w:pPr>
       <w:r>
-        <w:t xml:space="preserve">Plant-derived foods vary widely in composition with source, formulation and processing. This study compares four commercial products in two biochemical categories: protein in soy and almond milks, lipid in cold-pressed walnut and refined soybean oils. Bradford-reactive protein (mg BSA equivalents/mL) will be quantified by the Bradford assay, selected for its high sensitivity and tolerance of substantial dilution, which may reduce turbidity-related interference in plant-milk matrices. Acid value was selected as a relatively stable measure of free fatty acids and hydrolytic quality relevant to cold-pressed versus refined oils. Three production lots per product will be analysed in triplicate, and lot-level means compared using exploratory two-sided Welch t-tests, reporting effect sizes and confidence intervals alongside p-values. Supplied HPLC amino acid and GC fatty acid profiles will complement and extend interpretation of the wet-chemistry results. Soy milk is expected to show higher Bradford-reactive protein than almond milk, and walnut oil a higher acid value than soybean oil. As source, formulation and processing are not independently controlled, findings will be interpreted as product-specific differences rather than causal effects.</w:t>
+        <w:t xml:space="preserve">Plant-derived foods vary widely in composition with source, formulation and processing. This study compares four commercial products in two biochemical categories: protein in soy and almond milks, lipid in cold-pressed walnut and refined soybean oils. Bradford-reactive protein (mg BSA equivalents/mL) will be quantified by the Bradford assay, selected for its high sensitivity, which permits substantial sample dilution and may reduce turbidity-related interference in plant-milk matrices. Acid value was selected as a relatively stable measure of free fatty acids and hydrolytic quality relevant to cold-pressed versus refined oils. Three production lots per product will be analysed in triplicate, and lot-level means compared using exploratory two-sample t-tests in Minitab, reporting mean differences with 95% confidence intervals alongside p-values. Supplied HPLC amino acid and GC fatty acid profiles will complement and extend interpretation of the wet-chemistry results. Soy milk is expected to show higher Bradford-reactive protein than almond milk, and walnut oil a higher acid value than soybean oil. As source, formulation and processing are not independently controlled, findings will be interpreted as product-specific differences rather than causal effects.</w:t>
       </w:r>
     </w:p>
     <w:bookmarkEnd w:id="22"/>
@@ -306,7 +306,7 @@
         <w:pStyle w:val="FirstParagraph"/>
       </w:pPr>
       <w:r>
-        <w:t xml:space="preserve">Plant-derived foods occupy a growing share of the global food supply, driven by concerns about health, sustainability and animal welfare (Sethi et al., 2016). Plant-based products are compositionally heterogeneous, however: their protein and lipid content is associated both with the botanical raw material and with the unit operations used to convert it into a finished food (Vanga &amp; Raghavan, 2018). Examining these source- and processing-associated differences is central to evaluating the quality of plant-based alternatives.</w:t>
+        <w:t xml:space="preserve">Plant-derived foods occupy a growing share of the global food supply, driven by concerns about health, sustainability and animal welfare (Sethi et al., 2016). Plant-based products are compositionally heterogeneous, however: protein and lipid content is associated with both the botanical raw material and the unit operations that convert it into a finished food (Vanga &amp; Raghavan, 2018). Examining these source- and processing-associated differences is central to evaluating the quality of plant-based alternatives.</w:t>
       </w:r>
     </w:p>
     <w:p>
@@ -322,7 +322,7 @@
         <w:pStyle w:val="BodyText"/>
       </w:pPr>
       <w:r>
-        <w:t xml:space="preserve">Processing-associated differences are equally important. Plant milks are produced by soaking, wet milling, filtration, formulation and thermal treatment, steps that dilute and partially remove protein (Sethi et al., 2016). Edible oils diverge more sharply: cold pressing extracts oil mechanically at low temperature and retains free fatty acids (FFA), whereas industrial refining removes FFA through alkali neutralisation, bleaching and deodorisation (Gharby, 2022).</w:t>
+        <w:t xml:space="preserve">Processing-associated differences are equally important. Plant milks are produced by soaking, wet milling, filtration, formulation and thermal treatment, steps that dilute and partially remove protein (Sethi et al., 2016). Edible oils diverge more sharply: cold pressing extracts oil mechanically at relatively low temperature and does not include the alkali-neutralisation step used to remove free fatty acids (FFA), whereas industrial refining removes FFA through neutralisation and subsequent operations (Gharby, 2022).</w:t>
       </w:r>
     </w:p>
     <w:p>
@@ -330,7 +330,7 @@
         <w:pStyle w:val="BodyText"/>
       </w:pPr>
       <w:r>
-        <w:t xml:space="preserve">Because botanical source, formulation and processing are not independently manipulated in this study, the selected products represent combined commercial product conditions rather than isolated causal factors. The research question is therefore: how are source- and processing-associated differences reflected in Bradford-reactive protein concentration in commercial soy and almond milks and in acid value in cold-pressed walnut and refined soybean oils, and how can HPLC amino acid and GC fatty acid profiles support interpretation of these differences? The aim is to compare Bradford-reactive protein concentration and acid value among the selected products and to use the supplied HPLC and GC profiles to provide compositional context for the observed differences. Two hypotheses are proposed. H1: commercial soy milk will have a significantly higher Bradford-reactive protein concentration, expressed as BSA equivalents, than commercial almond milk. This expectation is consistent with the greater protein density of the legume raw material. H2: cold-pressed walnut oil will have a significantly higher acid value than refined soybean oil. This prediction is based on the removal of free fatty acids during alkali neutralisation in refining.</w:t>
+        <w:t xml:space="preserve">Because botanical source, formulation and processing are not independently manipulated in this study, the selected products represent combined commercial product conditions rather than isolated causal factors. The research question is therefore: how are source- and processing-associated differences reflected in Bradford-reactive protein concentration in commercial soy and almond milks and in acid value in cold-pressed walnut and refined soybean oils, and how can HPLC amino acid and GC fatty acid profiles support interpretation of these differences? The aim is to compare Bradford-reactive protein concentration and acid value among the selected products, using the supplied HPLC and GC profiles to provide compositional context for observed differences. Two hypotheses are proposed. H1: commercial soy milk will have a higher Bradford-reactive protein concentration, expressed as BSA equivalents, than commercial almond milk. This expectation is consistent with the greater protein density of the legume raw material. H2: cold-pressed walnut oil will have a higher acid value than refined soybean oil. This prediction is based on the removal of free fatty acids during alkali neutralisation in refining.</w:t>
       </w:r>
     </w:p>
     <w:bookmarkEnd w:id="23"/>
@@ -357,7 +357,7 @@
         <w:pStyle w:val="FirstParagraph"/>
       </w:pPr>
       <w:r>
-        <w:t xml:space="preserve">Soy and almond milks are the most established plant-based milk alternatives and provide a meaningful protein contrast. Commercial soy milk typically contains 2.9–3.3 g protein per 100 mL, comparable to bovine milk, whereas almond milk generally supplies only 0.4–0.6 g per 100 mL (Jeske et al., 2017; Vanga &amp; Raghavan, 2018). Because both beverages are manufactured through broadly similar operations, this difference likely reflects chiefly the raw material and formulation level rather than divergent processing chemistry (Sethi et al., 2016). The pairing highlights a source-associated difference and is nutritionally relevant, since consumers replacing dairy with almond milk may unknowingly reduce protein intake (Vanga &amp; Raghavan, 2018).</w:t>
+        <w:t xml:space="preserve">Soy and almond milks are the most established plant-based milk alternatives and provide a meaningful protein contrast. Commercial soy milk typically contains 2.9–3.3 g protein per 100 mL, comparable to bovine milk, whereas almond milk generally supplies only 0.4–0.6 g per 100 mL (Jeske et al., 2017; Vanga &amp; Raghavan, 2018). Because both beverages are manufactured through broadly similar operations, this difference likely reflects the raw material and formulation level rather than processing chemistry (Sethi et al., 2016). The pairing highlights a source-associated difference and is nutritionally relevant, since consumers replacing dairy with almond milk may unknowingly reduce protein intake (Vanga &amp; Raghavan, 2018).</w:t>
       </w:r>
     </w:p>
     <w:bookmarkEnd w:id="24"/>
@@ -375,7 +375,7 @@
         <w:pStyle w:val="FirstParagraph"/>
       </w:pPr>
       <w:r>
-        <w:t xml:space="preserve">The Bradford assay quantifies protein through binding of Coomassie Brilliant Blue G-250 to arginine and hydrophobic residues under acidic conditions, shifting the dye’s absorbance maximum from 465 to 595 nm (Bradford, 1976). Its advantages are sensitivity (approximately 1–20 µg protein), speed, and tolerance of common buffer components (Bradford, 1976; Kruger, 2009). This sensitivity, and the dilution it permits, is advantageous for plant-milk emulsions: measuring low-protein almond milk with the Biuret method, whose working range lies in the milligram region, would be more demanding (Gornall et al., 1949).</w:t>
+        <w:t xml:space="preserve">The Bradford assay quantifies protein through binding of Coomassie Brilliant Blue G-250 to arginine and hydrophobic residues under acidic conditions, shifting the dye’s absorbance maximum from 465 to 595 nm (Bradford, 1976). Its advantages are sensitivity (approximately 1–20 µg protein), speed, and tolerance of common buffer components (Bradford, 1976; Kruger, 2009). This sensitivity, and the dilution it permits, suits plant-milk emulsions: measuring low-protein almond milk with the Biuret method, whose working range lies in the milligram region, would be more demanding (Gornall et al., 1949).</w:t>
       </w:r>
     </w:p>
     <w:p>
@@ -383,7 +383,7 @@
         <w:pStyle w:val="BodyText"/>
       </w:pPr>
       <w:r>
-        <w:t xml:space="preserve">The Biuret method, in which Cu²⁺ complexes with peptide bonds in alkali to form a chromophore absorbing at 540 nm, responds to the peptide backbone rather than specific side chains, so its colour yield varies little between proteins (Gornall et al., 1949). By contrast, Bradford dye binding depends on amino acid composition, so plant proteins may respond differently from the bovine serum albumin (BSA) standard, and results can be depressed by detergents or non-linearity at high concentrations (Kruger, 2009). These limitations are manageable: all samples will be calibrated against the same BSA curve and reported as BSA equivalents, and the high dilutions Bradford permits may reduce the lipid turbidity that interferes with Biuret photometry. On balance, Bradford is the more defensible choice for dilute emulsified beverages, provided its dye-binding bias is interpreted alongside instrumental data.</w:t>
+        <w:t xml:space="preserve">The Biuret method, in which Cu²⁺ complexes with peptide bonds in alkali to form a chromophore absorbing at 540 nm, responds to the peptide backbone rather than specific side chains, so its colour yield varies little between proteins (Gornall et al., 1949). By contrast, Bradford dye binding depends on amino acid composition, so plant proteins may respond differently from the bovine serum albumin (BSA) standard, and results can be depressed by detergents or non-linearity (Kruger, 2009). These limitations are manageable: all samples will be calibrated against the same BSA curve and reported as BSA equivalents, and high dilution may reduce the lipid turbidity that interferes with Biuret photometry. On balance, Bradford is the more defensible choice for dilute emulsified beverages, provided its dye-binding bias is interpreted alongside instrumental data.</w:t>
       </w:r>
     </w:p>
     <w:bookmarkEnd w:id="25"/>
@@ -401,7 +401,7 @@
         <w:pStyle w:val="FirstParagraph"/>
       </w:pPr>
       <w:r>
-        <w:t xml:space="preserve">The Bradford assay reports only Bradford-reactive protein as BSA equivalents, with no information on protein quality, and its output is biased by amino acid composition (Kruger, 2009). The supplied HPLC amino acid dataset helps address both weaknesses. Because HPLC quantifies individual amino acids after hydrolysis and derivatisation (Otter, 2012), it provides compositional context for the Bradford totals, indicating whether dye-binding bias may have influenced the soy–almond comparison. The profile also extends the findings by showing whether soy milk delivers a more complete essential amino acid spectrum, particularly lysine, supporting nutritional interpretation.</w:t>
+        <w:t xml:space="preserve">The Bradford assay reports only Bradford-reactive protein as BSA equivalents, with no information on protein quality, and its output is biased by amino acid composition (Kruger, 2009). The supplied HPLC amino acid dataset helps address both weaknesses. Because HPLC quantifies individual amino acids after hydrolysis and derivatisation (Otter, 2012), it provides compositional context for the Bradford totals, indicating whether dye-binding bias influenced the soy–almond comparison. The profile also extends the findings by showing whether soy milk delivers a more complete essential amino acid spectrum, particularly lysine, supporting nutritional interpretation.</w:t>
       </w:r>
     </w:p>
     <w:bookmarkEnd w:id="26"/>
@@ -419,7 +419,7 @@
         <w:pStyle w:val="FirstParagraph"/>
       </w:pPr>
       <w:r>
-        <w:t xml:space="preserve">Walnut and soybean oils form a pairing in which both source and processing differ systematically. Walnut oil contains approximately 70% polyunsaturated fatty acids, including 10–14% α-linolenic acid, and is typically cold-pressed to preserve flavour and minor constituents (Martínez et al., 2010). Soybean oil, dominated by linoleic acid, is almost universally chemically refined, including alkali neutralisation that removes free fatty acids (Gharby, 2022). Comparing cold-pressed with refined oil provides a relevant contrast in processing-associated hydrolytic quality: Codex standards permit acid values up to 4.0 mg KOH/g in cold-pressed but only 0.6 in refined oils (Codex Alimentarius Commission, 1999). The pairing is also nutritionally relevant, as both oils are marketed as sources of essential fatty acids whose quality deteriorates through hydrolysis and oxidation (Choe &amp; Min, 2006).</w:t>
+        <w:t xml:space="preserve">Walnut and soybean oils form a pairing in which both source and processing differ systematically. Walnut oil contains approximately 70% polyunsaturated fatty acids, including 10–14% α-linolenic acid, and is typically cold-pressed to preserve flavour and minor constituents (Martínez et al., 2010). Soybean oil, dominated by linoleic acid, is almost universally chemically refined, including alkali neutralisation that removes free fatty acids (Gharby, 2022). Comparing cold-pressed with refined oil provides a relevant contrast in processing-associated hydrolytic quality: Codex standards permit acid values up to 4.0 mg KOH/g in cold-pressed but only 0.6 in refined oils (Codex Alimentarius Commission, 1999). Both oils are also marketed as sources of essential fatty acids whose quality deteriorates through hydrolysis and oxidation (Choe &amp; Min, 2006).</w:t>
       </w:r>
     </w:p>
     <w:bookmarkEnd w:id="27"/>
@@ -437,7 +437,7 @@
         <w:pStyle w:val="FirstParagraph"/>
       </w:pPr>
       <w:r>
-        <w:t xml:space="preserve">Acid value (AV) measures hydrolytic rancidity as the milligrams of potassium hydroxide required to neutralise the free fatty acids in 1 g of oil, determined by titration to a phenolphthalein endpoint (AOCS, 2017). FFA are chemically stable analytes, so AV changes little between sampling and analysis. AV is also relevant to the processing contrast, because refining neutralisation is designed to remove FFA (Gharby, 2022), although raw material quality, lipase activity and storage conditions also influence free acidity. Finally, the titration is simple, inexpensive and reproducible with a standardised titrant.</w:t>
+        <w:t xml:space="preserve">Acid value (AV) measures hydrolytic rancidity as milligrams of potassium hydroxide needed to neutralise the free fatty acids in 1 g of oil, by titration to a phenolphthalein endpoint (AOCS, 2017). FFA are chemically stable analytes, so AV changes little between sampling and analysis. AV is also relevant to the processing contrast because refining neutralisation removes FFA (Gharby, 2022), although raw material quality, lipase activity and storage conditions also influence free acidity. The titration is also simple, inexpensive and reproducible.</w:t>
       </w:r>
     </w:p>
     <w:p>
@@ -445,7 +445,7 @@
         <w:pStyle w:val="BodyText"/>
       </w:pPr>
       <w:r>
-        <w:t xml:space="preserve">Peroxide value (PV), the alternative, measures primary oxidation by iodometric titration of hydroperoxides (AOCS, 2017). Although PV detects early oxidative rancidity (Choe &amp; Min, 2006), it is weak for single-time-point comparisons: hydroperoxides are transient intermediates that accumulate and then decompose, so an identical PV can reflect early or advanced oxidation (Shahidi &amp; Zhong, 2005). The iodometric procedure is also sensitive to light, temperature and dissolved oxygen (Shahidi &amp; Zhong, 2005), so AV is preferred as the more stable index. Its limitations are acknowledged: AV is blind to oxidative deterioration, and endpoint detection can be obscured in deeply coloured oils, though both selected oils permit reliable titration.</w:t>
+        <w:t xml:space="preserve">Peroxide value (PV), the alternative, measures primary oxidation by iodometric titration of hydroperoxides (AOCS, 2017). Although PV detects early oxidative rancidity (Choe &amp; Min, 2006), it is weak for single-time-point comparisons: hydroperoxides accumulate and then decompose, so an identical PV can reflect early or advanced oxidation (Shahidi &amp; Zhong, 2005). The iodometric procedure is also sensitive to light, temperature and dissolved oxygen (Shahidi &amp; Zhong, 2005), so AV is preferred as the more stable index. AV is blind to oxidative deterioration, and endpoint detection can be obscured in deeply coloured oils, though both selected oils permit reliable titration.</w:t>
       </w:r>
     </w:p>
     <w:bookmarkEnd w:id="28"/>
@@ -463,7 +463,7 @@
         <w:pStyle w:val="FirstParagraph"/>
       </w:pPr>
       <w:r>
-        <w:t xml:space="preserve">Acid value quantifies total free acidity but cannot identify the fatty acids present nor characterise the unsaturation that governs susceptibility to further deterioration. The supplied GC fatty acid profile, obtained as fatty acid methyl esters, helps address both limitations. It complements the wet-chemistry interpretation by indicating whether expected signatures, such as the high α-linolenic acid content of authentic walnut oil, are present (Martínez et al., 2010). It also extends the findings: polyunsaturated-to-saturated ratios from the chromatograms will contextualise why AV differences matter, since liberated polyunsaturated FFA oxidise faster than their esterified forms (Choe &amp; Min, 2006).</w:t>
+        <w:t xml:space="preserve">Acid value quantifies total free acidity but cannot identify the fatty acids present nor characterise the unsaturation that governs susceptibility to further deterioration. The supplied GC fatty acid profile, obtained as fatty acid methyl esters, helps address both limitations. It complements the wet-chemistry interpretation by indicating whether expected signatures, such as the high α-linolenic acid content of authentic walnut oil, are present (Martínez et al., 2010). It also extends the findings: polyunsaturated-to-saturated ratios from the chromatograms will show why AV differences matter, since liberated polyunsaturated FFA oxidise faster than esterified forms (Choe &amp; Min, 2006).</w:t>
       </w:r>
     </w:p>
     <w:bookmarkEnd w:id="29"/>
@@ -482,7 +482,7 @@
         <w:pStyle w:val="FirstParagraph"/>
       </w:pPr>
       <w:r>
-        <w:t xml:space="preserve">The study uses a comparative cross-sectional design with two parallel arms. The independent variable in each arm is product identity, representing a combined commercial condition involving source, formulation and processing: soy versus almond milk, and cold-pressed walnut versus refined soybean oil. The dependent variables are Bradford-reactive protein concentration (mg BSA equivalents/mL) and acid value (mg KOH/g oil). Three independent retail units from different production lots per product will serve as production-lot replicates, each analysed in analytical triplicate; triplicates will be averaged so that lot means are the independent observations (n = 3 per group), avoiding pseudoreplication. To limit unnecessary variation, milks will be unflavoured, unsweetened and of similar fortification status, and oils will be single-species, non-blended and explicitly labelled cold-pressed or refined; brand, ingredient list, nutrition label, packaging, lot number and best-before date will be recorded, with brand and formulation acknowledged as potential confounders. All samples will be stored as recommended and analysed within a single week.</w:t>
+        <w:t xml:space="preserve">The study uses a comparative cross-sectional design with two parallel arms. The independent variable in each arm is product identity, representing a combined commercial condition involving source, formulation and processing: soy versus almond milk, and cold-pressed walnut versus refined soybean oil. The dependent variables are Bradford-reactive protein concentration (mg BSA equivalents/mL) and acid value (mg KOH/g oil). Three retail units of the same brand and formulation, bearing different production-lot numbers, will be obtained per product as production-lot replicates, each analysed in analytical triplicate; triplicates will be averaged so that lot means are the independent observations (n = 3 per group), avoiding pseudoreplication. To limit unnecessary variation, milks will be unflavoured, unsweetened and similarly fortified, and oils single-species, non-blended and explicitly labelled cold-pressed or refined; brand, ingredient list, nutrition label, packaging, lot number and best-before date will be recorded, with brand and formulation acknowledged as potential confounders. Samples will be stored as recommended and analysed within one week, with analysis order randomised and product types interleaved within each session to minimise order, day and instrument-drift effects.</w:t>
       </w:r>
     </w:p>
     <w:p>
@@ -490,7 +490,7 @@
         <w:pStyle w:val="BodyText"/>
       </w:pPr>
       <w:r>
-        <w:t xml:space="preserve">In the protein arm, all milks will receive identical homogenisation before dilution with phosphate-buffered saline into the Bradford working range, using at least two dilution factors per sample to check dilution linearity. A seven-point BSA calibration curve (0.1–1.0 mg/mL) will be prepared each session and accepted only if R² ≥ 0.995 and a mid-curve quality-control standard recovers within 90–110%. A reagent blank will zero the spectrophotometer at 595 nm, sample-specific matrix blanks will correct background absorbance, and spike-recovery checks will be performed if interference is suspected (Bradford, 1976). Absorbances outside the calibration range will be re-diluted rather than extrapolated. In the lipid arm, acid value will follow AOCS Method Cd 3d-63: each lot will be mixed before subsampling, dissolved in neutralised solvent and titrated in triplicate with standardised 0.1 M ethanolic KOH to a consistent persistent phenolphthalein endpoint, with a solvent blank subtracted (AOCS, 2017). All titrations will be performed at the same temperature within a narrow time window, and AV differences will be interpreted as differences in free acidity among products rather than attributed solely to refining.</w:t>
+        <w:t xml:space="preserve">In the protein arm, milks will receive identical homogenisation before dilution with phosphate-buffered saline into the Bradford working range, using two dilution factors per sample to check dilution linearity. A seven-point BSA calibration curve (nominally 0.1–1.0 mg/mL, per the laboratory protocol) will be prepared each session and accepted only if R² ≥ 0.995 and a mid-curve quality-control standard recovers within 90–110%. A reagent blank will zero the spectrophotometer at 595 nm, and sample-specific background correction and spike-recovery assessment will be conducted where permitted by the available laboratory protocol and reagents (Bradford, 1976). Absorbances outside the calibration range will be re-diluted rather than extrapolated. In the lipid arm, acid value will follow AOCS Method Cd 3d-63: each lot will be mixed before subsampling, dissolved in neutralised solvent and titrated in triplicate with 0.1 M ethanolic KOH, standardised against potassium hydrogen phthalate per the laboratory protocol, to a consistent phenolphthalein endpoint, with a solvent blank subtracted (AOCS, 2017). Titrations will occur at the same temperature within a narrow time window, and AV differences will be interpreted as free-acidity differences among products rather than attributed solely to refining.</w:t>
       </w:r>
     </w:p>
     <w:p>
@@ -498,7 +498,7 @@
         <w:pStyle w:val="BodyText"/>
       </w:pPr>
       <w:r>
-        <w:t xml:space="preserve">Because only three independent lots are available per group, formal normality and variance tests would be uninformative; lot-level means will instead be compared with exploratory two-sided Welch t-tests (α = .05), which do not assume equal variances. Each comparison will report individual lot-level data points, mean ± standard deviation, mean difference, 95% confidence interval, p-value and Hedges’ g, a small-sample-corrected effect size. Results will be presented as individual value plots displaying all lot-level observations with group means and variability estimates, rather than bar charts alone. Bradford and HPLC findings will be compared descriptively in terms of the direction and relative magnitude of product differences, since the supplied profiles may not be lot-matched. GC data will be summarised as relative percentages of major fatty acids (linoleic, α-linolenic, total saturated, total polyunsaturated) and used descriptively to contextualise oil identity and unsaturation rather than to validate acid value. Key limitations include the lack of independent control over source, formulation and processing, the few lots, the single time point, protein-specific dye-binding bias against the BSA calibrant, AV’s insensitivity to oxidation, possible mismatch between supplied instrumental data and experimental lots, and the exploratory nature of inference at n = 3.</w:t>
+        <w:t xml:space="preserve">Statistical analysis will use the course two-sample t-test, performed in Minitab as a two-sided test (α = .05) on lot means in each category. The taught assumptions (continuous data, independent representative observations, no extreme outliers, approximate normality) will be considered through study design and individual value plots, because formal tests are uninformative with three lots per group. Each comparison will report lot-level data points, mean ± standard deviation, and the Minitab t-value, p-value and mean difference with its 95% confidence interval; with n = 3, inference is exploratory. Results will be presented as individual value plots showing all lot-level observations with group means, rather than bar charts alone. Bradford and HPLC findings will be compared descriptively in direction and relative magnitude, since the supplied profiles may not be lot-matched. GC data will be summarised as relative percentages of major fatty acids (linoleic, α-linolenic, total saturated, total polyunsaturated) and used descriptively to contextualise oil identity and unsaturation, not to validate acid value. Key limitations include the lack of independent control over source, formulation and processing, the few lots, the single time point, protein-specific dye-binding bias against the BSA calibrant, AV’s insensitivity to oxidation, possible mismatch between supplied instrumental data and experimental lots, and exploratory inference at n = 3.</w:t>
       </w:r>
     </w:p>
     <w:bookmarkEnd w:id="31"/>
@@ -516,7 +516,7 @@
         <w:pStyle w:val="FirstParagraph"/>
       </w:pPr>
       <w:r>
-        <w:t xml:space="preserve">This proposal presents a feasible design for comparing protein- and lipid-related differences among commercial plant-derived foods. The protein arm contrasts a legume-based and a nut-based milk using the Bradford assay, justified against the Biuret method, while the lipid arm contrasts a cold-pressed and a refined oil using acid value, justified against peroxide value. Supplied HPLC and GC datasets will complement the wet-chemistry results and extend their interpretation toward amino acid composition and fatty acid unsaturation. With production-lot replication, blanks, calibration standards and exploratory statistics, the study is expected to identify product-specific differences consistent with source, formulation and processing, providing practically relevant evidence for consumers and manufacturers of plant-based foods.</w:t>
+        <w:t xml:space="preserve">This proposal presents a feasible design for comparing protein- and lipid-related differences among commercial plant-derived foods. The protein arm contrasts a legume-based and a nut-based milk using the Bradford assay, justified against the Biuret method, while the lipid arm contrasts a cold-pressed and a refined oil using acid value, justified against peroxide value. Supplied HPLC and GC datasets will complement the wet-chemistry results and extend their interpretation toward amino acid composition and fatty acid unsaturation. With production-lot replication, blanks, calibration standards and exploratory statistics, the study is expected to identify product-specific differences consistent with source, formulation and processing, providing practically relevant evidence for consumers and manufacturers.</w:t>
       </w:r>
     </w:p>
     <w:bookmarkEnd w:id="32"/>

</xml_diff>

<commit_message>
Condense Abstract to ~150 words and Introduction to ~300 words; add lot-availability feasibility note
Co-authored-by: fran0220 <fran0220@users.noreply.github.com>
</commit_message>
<xml_diff>
--- a/docs/proposal/The_Effects_of_Source_and_Processing_on_Protein_and_Lipid_in_Plant-Derived_Foods.docx
+++ b/docs/proposal/The_Effects_of_Source_and_Processing_on_Protein_and_Lipid_in_Plant-Derived_Foods.docx
@@ -288,7 +288,7 @@
         <w:pStyle w:val="FirstParagraph"/>
       </w:pPr>
       <w:r>
-        <w:t xml:space="preserve">Plant-derived foods vary widely in composition with source, formulation and processing. This study compares four commercial products in two biochemical categories: protein in soy and almond milks, lipid in cold-pressed walnut and refined soybean oils. Bradford-reactive protein (mg BSA equivalents/mL) will be quantified by the Bradford assay, selected for its high sensitivity, which permits substantial sample dilution and may reduce turbidity-related interference in plant-milk matrices. Acid value was selected as a relatively stable measure of free fatty acids and hydrolytic quality relevant to cold-pressed versus refined oils. Three production lots per product will be analysed in triplicate, and lot-level means compared using exploratory two-sample t-tests in Minitab, reporting mean differences with 95% confidence intervals alongside p-values. Supplied HPLC amino acid and GC fatty acid profiles will complement and extend interpretation of the wet-chemistry results. Soy milk is expected to show higher Bradford-reactive protein than almond milk, and walnut oil a higher acid value than soybean oil. As source, formulation and processing are not independently controlled, findings will be interpreted as product-specific differences rather than causal effects.</w:t>
+        <w:t xml:space="preserve">Plant-derived foods vary in composition with source, formulation and processing. This study compares protein in commercial soy and almond milks and lipid in cold-pressed walnut and refined soybean oils. Bradford-reactive protein (mg BSA equivalents/mL) will be measured by the Bradford assay, selected for its high sensitivity, which permits substantial sample dilution and may reduce turbidity-related interference; acid value was selected as a relatively stable measure of free fatty acids in cold-pressed versus refined oils. Three production lots per product will be analysed in triplicate, and lot means compared with exploratory two-sample t-tests in Minitab, reporting mean differences, 95% confidence intervals and p-values. HPLC amino acid and GC fatty acid profiles will complement and extend interpretation. Soy milk is expected to show higher Bradford-reactive protein and walnut oil a higher acid value; because source, formulation and processing are not independently controlled, findings represent product-specific differences rather than causal effects.</w:t>
       </w:r>
     </w:p>
     <w:bookmarkEnd w:id="22"/>
@@ -306,7 +306,7 @@
         <w:pStyle w:val="FirstParagraph"/>
       </w:pPr>
       <w:r>
-        <w:t xml:space="preserve">Plant-derived foods occupy a growing share of the global food supply, driven by concerns about health, sustainability and animal welfare (Sethi et al., 2016). Plant-based products are compositionally heterogeneous, however: protein and lipid content is associated with both the botanical raw material and the unit operations that convert it into a finished food (Vanga &amp; Raghavan, 2018). Examining these source- and processing-associated differences is central to evaluating the quality of plant-based alternatives.</w:t>
+        <w:t xml:space="preserve">Plant-derived foods occupy a growing share of the global food supply, yet their composition varies with both the botanical raw material and the unit operations that produce the finished food (Sethi et al., 2016; Vanga &amp; Raghavan, 2018). Source-associated differences arise because plant tissues store macronutrients differently: soybeans contain roughly 36–40% protein on a dry basis, whereas in almonds lipid is the dominant storage reserve, and walnut oil is unusually rich in α-linolenic acid (Martínez et al., 2010; Vanga &amp; Raghavan, 2018).</w:t>
       </w:r>
     </w:p>
     <w:p>
@@ -314,7 +314,7 @@
         <w:pStyle w:val="BodyText"/>
       </w:pPr>
       <w:r>
-        <w:t xml:space="preserve">Source-associated differences arise because different plant tissues store macronutrients differently. Soybeans are protein-dense legume seeds containing roughly 36–40% protein on a dry basis, whereas in almonds lipid, not protein, is the dominant storage reserve (Vanga &amp; Raghavan, 2018). Walnut and soybean oils likewise differ in fatty acid composition, with walnut oil unusually rich in α-linolenic acid (Martínez et al., 2010).</w:t>
+        <w:t xml:space="preserve">Processing matters equally: plant milks are produced by soaking, wet milling, filtration, formulation and thermal treatment, steps that dilute and partially remove protein (Sethi et al., 2016). Cold pressing extracts oil mechanically at relatively low temperature and does not include the alkali-neutralisation step used to remove free fatty acids (FFA), whereas industrial refining removes FFA through neutralisation and subsequent operations (Gharby, 2022).</w:t>
       </w:r>
     </w:p>
     <w:p>
@@ -322,15 +322,7 @@
         <w:pStyle w:val="BodyText"/>
       </w:pPr>
       <w:r>
-        <w:t xml:space="preserve">Processing-associated differences are equally important. Plant milks are produced by soaking, wet milling, filtration, formulation and thermal treatment, steps that dilute and partially remove protein (Sethi et al., 2016). Edible oils diverge more sharply: cold pressing extracts oil mechanically at relatively low temperature and does not include the alkali-neutralisation step used to remove free fatty acids (FFA), whereas industrial refining removes FFA through neutralisation and subsequent operations (Gharby, 2022).</w:t>
-      </w:r>
-    </w:p>
-    <w:p>
-      <w:pPr>
-        <w:pStyle w:val="BodyText"/>
-      </w:pPr>
-      <w:r>
-        <w:t xml:space="preserve">Because botanical source, formulation and processing are not independently manipulated in this study, the selected products represent combined commercial product conditions rather than isolated causal factors. The research question is therefore: how are source- and processing-associated differences reflected in Bradford-reactive protein concentration in commercial soy and almond milks and in acid value in cold-pressed walnut and refined soybean oils, and how can HPLC amino acid and GC fatty acid profiles support interpretation of these differences? The aim is to compare Bradford-reactive protein concentration and acid value among the selected products, using the supplied HPLC and GC profiles to provide compositional context for observed differences. Two hypotheses are proposed. H1: commercial soy milk will have a higher Bradford-reactive protein concentration, expressed as BSA equivalents, than commercial almond milk. This expectation is consistent with the greater protein density of the legume raw material. H2: cold-pressed walnut oil will have a higher acid value than refined soybean oil. This prediction is based on the removal of free fatty acids during alkali neutralisation in refining.</w:t>
+        <w:t xml:space="preserve">Because source, formulation and processing are not independently manipulated in this study, the selected products represent combined commercial conditions rather than isolated causal factors. The research question is: how are source- and processing-associated differences reflected in Bradford-reactive protein concentration in commercial soy and almond milks and in acid value in cold-pressed walnut and refined soybean oils, and how can HPLC amino acid and GC fatty acid profiles support interpretation of these differences? The aim is to compare Bradford-reactive protein concentration and acid value among the selected products, using the supplied HPLC and GC profiles to provide compositional context. Two hypotheses are proposed. H1: commercial soy milk will have a higher Bradford-reactive protein concentration (BSA equivalents) than commercial almond milk, consistent with the greater protein density of the legume raw material. H2: cold-pressed walnut oil will have a higher acid value than refined soybean oil, based on the removal of free fatty acids during refining neutralisation.</w:t>
       </w:r>
     </w:p>
     <w:bookmarkEnd w:id="23"/>
@@ -482,7 +474,7 @@
         <w:pStyle w:val="FirstParagraph"/>
       </w:pPr>
       <w:r>
-        <w:t xml:space="preserve">The study uses a comparative cross-sectional design with two parallel arms. The independent variable in each arm is product identity, representing a combined commercial condition involving source, formulation and processing: soy versus almond milk, and cold-pressed walnut versus refined soybean oil. The dependent variables are Bradford-reactive protein concentration (mg BSA equivalents/mL) and acid value (mg KOH/g oil). Three retail units of the same brand and formulation, bearing different production-lot numbers, will be obtained per product as production-lot replicates, each analysed in analytical triplicate; triplicates will be averaged so that lot means are the independent observations (n = 3 per group), avoiding pseudoreplication. To limit unnecessary variation, milks will be unflavoured, unsweetened and similarly fortified, and oils single-species, non-blended and explicitly labelled cold-pressed or refined; brand, ingredient list, nutrition label, packaging, lot number and best-before date will be recorded, with brand and formulation acknowledged as potential confounders. Samples will be stored as recommended and analysed within one week, with analysis order randomised and product types interleaved within each session to minimise order, day and instrument-drift effects.</w:t>
+        <w:t xml:space="preserve">The study uses a comparative cross-sectional design with two parallel arms. The independent variable in each arm is product identity, representing a combined commercial condition involving source, formulation and processing: soy versus almond milk, and cold-pressed walnut versus refined soybean oil. The dependent variables are Bradford-reactive protein concentration (mg BSA equivalents/mL) and acid value (mg KOH/g oil). Three retail units of the same brand and formulation, bearing different production-lot numbers, will be obtained per product as production-lot replicates, each analysed in analytical triplicate; triplicates will be averaged so that lot means are the independent observations (n = 3 per group), avoiding pseudoreplication. To limit unnecessary variation, milks will be unflavoured, unsweetened and similarly fortified, and oils single-species, non-blended and explicitly labelled cold-pressed or refined; brand, ingredient list, nutrition label, packaging, lot number and best-before date will be recorded, with brand and formulation acknowledged as potential confounders. The availability of three lots per brand will be confirmed with retailers before purchase, and any supply constraints will be discussed with the teaching team before the design is finalised. Samples will be stored as recommended and analysed within one week, with analysis order randomised and product types interleaved within each session to minimise order, day and instrument-drift effects.</w:t>
       </w:r>
     </w:p>
     <w:p>

</xml_diff>

<commit_message>
Keep total word count above 2000 after section reductions
Co-authored-by: fran0220 <fran0220@users.noreply.github.com>
</commit_message>
<xml_diff>
--- a/docs/proposal/The_Effects_of_Source_and_Processing_on_Protein_and_Lipid_in_Plant-Derived_Foods.docx
+++ b/docs/proposal/The_Effects_of_Source_and_Processing_on_Protein_and_Lipid_in_Plant-Derived_Foods.docx
@@ -393,7 +393,7 @@
         <w:pStyle w:val="FirstParagraph"/>
       </w:pPr>
       <w:r>
-        <w:t xml:space="preserve">The Bradford assay reports only Bradford-reactive protein as BSA equivalents, with no information on protein quality, and its output is biased by amino acid composition (Kruger, 2009). The supplied HPLC amino acid dataset helps address both weaknesses. Because HPLC quantifies individual amino acids after hydrolysis and derivatisation (Otter, 2012), it provides compositional context for the Bradford totals, indicating whether dye-binding bias influenced the soy–almond comparison. The profile also extends the findings by showing whether soy milk delivers a more complete essential amino acid spectrum, particularly lysine, supporting nutritional interpretation.</w:t>
+        <w:t xml:space="preserve">The Bradford assay reports only Bradford-reactive protein as BSA equivalents, with no information on protein quality, and its output is biased by amino acid composition (Kruger, 2009). The supplied HPLC amino acid dataset helps address both weaknesses. Because HPLC quantifies individual amino acids after hydrolysis and derivatisation (Otter, 2012), it provides compositional context for the Bradford totals, indicating whether dye-binding bias influenced the soy–almond comparison. The profile also extends the findings by showing whether soy milk delivers a more complete essential amino acid spectrum, particularly lysine, supporting nutritional interpretation in the final presentation.</w:t>
       </w:r>
     </w:p>
     <w:bookmarkEnd w:id="26"/>
@@ -490,7 +490,7 @@
         <w:pStyle w:val="BodyText"/>
       </w:pPr>
       <w:r>
-        <w:t xml:space="preserve">Statistical analysis will use the course two-sample t-test, performed in Minitab as a two-sided test (α = .05) on lot means in each category. The taught assumptions (continuous data, independent representative observations, no extreme outliers, approximate normality) will be considered through study design and individual value plots, because formal tests are uninformative with three lots per group. Each comparison will report lot-level data points, mean ± standard deviation, and the Minitab t-value, p-value and mean difference with its 95% confidence interval; with n = 3, inference is exploratory. Results will be presented as individual value plots showing all lot-level observations with group means, rather than bar charts alone. Bradford and HPLC findings will be compared descriptively in direction and relative magnitude, since the supplied profiles may not be lot-matched. GC data will be summarised as relative percentages of major fatty acids (linoleic, α-linolenic, total saturated, total polyunsaturated) and used descriptively to contextualise oil identity and unsaturation, not to validate acid value. Key limitations include the lack of independent control over source, formulation and processing, the few lots, the single time point, protein-specific dye-binding bias against the BSA calibrant, AV’s insensitivity to oxidation, possible mismatch between supplied instrumental data and experimental lots, and exploratory inference at n = 3.</w:t>
+        <w:t xml:space="preserve">Statistical analysis will use the course two-sample t-test, performed in Minitab as a two-sided test (α = .05) on lot means in each category. The taught assumptions (continuous data, independent representative observations, no extreme outliers, approximate normality) will be considered through study design and individual value plots, because formal tests are uninformative with three lots per group. Each comparison will report lot-level data points, mean ± standard deviation, and the Minitab t-value, p-value and mean difference with its 95% confidence interval; with n = 3, inference is exploratory. Results will be presented as individual value plots showing all lot-level observations with group means, rather than bar charts alone. Bradford and HPLC findings will be compared descriptively in direction and relative magnitude, since the supplied profiles may not be lot-matched. GC data will be summarised as relative percentages of major fatty acids (linoleic, α-linolenic, total saturated, total polyunsaturated) and used descriptively to contextualise oil identity and unsaturation, not to validate acid value; the direction of these differences will be integrated with the wet-chemistry results in the final presentation. Key limitations include the lack of independent control over source, formulation and processing, the few lots, the single time point, protein-specific dye-binding bias against the BSA calibrant, AV’s insensitivity to oxidation, possible mismatch between supplied instrumental data and experimental lots, and exploratory inference at n = 3.</w:t>
       </w:r>
     </w:p>
     <w:bookmarkEnd w:id="31"/>

</xml_diff>